<commit_message>
updated kubernetes notes md
</commit_message>
<xml_diff>
--- a/Kubernetes Notes.docx
+++ b/Kubernetes Notes.docx
@@ -128,12 +128,13 @@
       <w:r>
         <w:rPr>
           <w:rFonts w:ascii="Calibri" w:hAnsi="Calibri" w:cs="Calibri"/>
+          <w:noProof/>
           <w:lang w:val="en-GB"/>
         </w:rPr>
         <w:drawing>
-          <wp:inline distT="0" distB="0" distL="0" distR="0" wp14:anchorId="5576E833" wp14:editId="4DB6C3D1">
-            <wp:extent cx="5239481" cy="4124901"/>
-            <wp:effectExtent l="0" t="0" r="0" b="9525"/>
+          <wp:inline distT="0" distB="0" distL="0" distR="0" wp14:anchorId="5576E833" wp14:editId="102D1320">
+            <wp:extent cx="5337426" cy="4202011"/>
+            <wp:effectExtent l="0" t="0" r="0" b="8255"/>
             <wp:docPr id="1407824515" name="Picture 1"/>
             <wp:cNvGraphicFramePr>
               <a:graphicFrameLocks xmlns:a="http://schemas.openxmlformats.org/drawingml/2006/main" noChangeAspect="1"/>
@@ -154,7 +155,7 @@
                   <pic:spPr>
                     <a:xfrm>
                       <a:off x="0" y="0"/>
-                      <a:ext cx="5239481" cy="4124901"/>
+                      <a:ext cx="5350601" cy="4212384"/>
                     </a:xfrm>
                     <a:prstGeom prst="rect">
                       <a:avLst/>
@@ -509,6 +510,1134 @@
       <w:pPr>
         <w:rPr>
           <w:rFonts w:ascii="Calibri" w:hAnsi="Calibri" w:cs="Calibri"/>
+          <w:lang w:val="en-GB"/>
+        </w:rPr>
+      </w:pPr>
+    </w:p>
+    <w:p>
+      <w:pPr>
+        <w:jc w:val="center"/>
+        <w:rPr>
+          <w:rFonts w:ascii="Calibri" w:hAnsi="Calibri" w:cs="Calibri"/>
+          <w:b/>
+          <w:bCs/>
+          <w:sz w:val="28"/>
+          <w:szCs w:val="28"/>
+          <w:lang w:val="en-GB"/>
+        </w:rPr>
+      </w:pPr>
+      <w:r>
+        <w:rPr>
+          <w:rFonts w:ascii="Calibri" w:hAnsi="Calibri" w:cs="Calibri"/>
+          <w:b/>
+          <w:bCs/>
+          <w:sz w:val="28"/>
+          <w:szCs w:val="28"/>
+          <w:lang w:val="en-GB"/>
+        </w:rPr>
+        <w:t>Service</w:t>
+      </w:r>
+    </w:p>
+    <w:p>
+      <w:pPr>
+        <w:rPr>
+          <w:rFonts w:ascii="Calibri" w:hAnsi="Calibri" w:cs="Calibri"/>
+        </w:rPr>
+      </w:pPr>
+      <w:r>
+        <w:rPr>
+          <w:rFonts w:ascii="Calibri" w:hAnsi="Calibri" w:cs="Calibri"/>
+          <w:lang w:val="en-GB"/>
+        </w:rPr>
+        <w:t xml:space="preserve">K8S Services: </w:t>
+      </w:r>
+      <w:r>
+        <w:rPr>
+          <w:rFonts w:ascii="Calibri" w:hAnsi="Calibri" w:cs="Calibri"/>
+        </w:rPr>
+        <w:t xml:space="preserve">It assigns a constant virtual IP address and DNS name (via </w:t>
+      </w:r>
+      <w:proofErr w:type="spellStart"/>
+      <w:r>
+        <w:rPr>
+          <w:rFonts w:ascii="Calibri" w:hAnsi="Calibri" w:cs="Calibri"/>
+        </w:rPr>
+        <w:t>CoreDNS</w:t>
+      </w:r>
+      <w:proofErr w:type="spellEnd"/>
+      <w:r>
+        <w:rPr>
+          <w:rFonts w:ascii="Calibri" w:hAnsi="Calibri" w:cs="Calibri"/>
+        </w:rPr>
+        <w:t>) to a set of pods.</w:t>
+      </w:r>
+      <w:r>
+        <w:rPr>
+          <w:rFonts w:ascii="Calibri" w:hAnsi="Calibri" w:cs="Calibri"/>
+        </w:rPr>
+        <w:t xml:space="preserve"> </w:t>
+      </w:r>
+      <w:r>
+        <w:rPr>
+          <w:rFonts w:ascii="Calibri" w:hAnsi="Calibri" w:cs="Calibri"/>
+        </w:rPr>
+        <w:t>Because pods are ephemeral and constantly changing IP addresses when they restart or scale, a Service acts as a reliable intermediary for internal and external communication</w:t>
+      </w:r>
+    </w:p>
+    <w:p>
+      <w:pPr>
+        <w:rPr>
+          <w:rFonts w:ascii="Calibri" w:hAnsi="Calibri" w:cs="Calibri"/>
+        </w:rPr>
+      </w:pPr>
+    </w:p>
+    <w:p>
+      <w:pPr>
+        <w:rPr>
+          <w:rFonts w:ascii="Calibri" w:hAnsi="Calibri" w:cs="Calibri"/>
+        </w:rPr>
+      </w:pPr>
+      <w:r>
+        <w:rPr>
+          <w:rFonts w:ascii="Calibri" w:hAnsi="Calibri" w:cs="Calibri"/>
+        </w:rPr>
+        <w:t>Types of ser</w:t>
+      </w:r>
+      <w:r>
+        <w:rPr>
+          <w:rFonts w:ascii="Calibri" w:hAnsi="Calibri" w:cs="Calibri"/>
+        </w:rPr>
+        <w:t xml:space="preserve">vices: </w:t>
+      </w:r>
+      <w:r>
+        <w:rPr>
+          <w:rFonts w:ascii="Calibri" w:hAnsi="Calibri" w:cs="Calibri"/>
+        </w:rPr>
+        <w:br/>
+      </w:r>
+      <w:proofErr w:type="spellStart"/>
+      <w:r>
+        <w:rPr>
+          <w:rFonts w:ascii="Calibri" w:hAnsi="Calibri" w:cs="Calibri"/>
+        </w:rPr>
+        <w:t>ClusterIP</w:t>
+      </w:r>
+      <w:proofErr w:type="spellEnd"/>
+      <w:r>
+        <w:rPr>
+          <w:rFonts w:ascii="Calibri" w:hAnsi="Calibri" w:cs="Calibri"/>
+        </w:rPr>
+        <w:br/>
+      </w:r>
+      <w:proofErr w:type="spellStart"/>
+      <w:r>
+        <w:rPr>
+          <w:rFonts w:ascii="Calibri" w:hAnsi="Calibri" w:cs="Calibri"/>
+        </w:rPr>
+        <w:t>nodeport</w:t>
+      </w:r>
+      <w:proofErr w:type="spellEnd"/>
+      <w:r>
+        <w:rPr>
+          <w:rFonts w:ascii="Calibri" w:hAnsi="Calibri" w:cs="Calibri"/>
+        </w:rPr>
+        <w:br/>
+        <w:t>External Names</w:t>
+      </w:r>
+    </w:p>
+    <w:p>
+      <w:pPr>
+        <w:rPr>
+          <w:rFonts w:ascii="Calibri" w:hAnsi="Calibri" w:cs="Calibri"/>
+          <w:sz w:val="20"/>
+          <w:szCs w:val="20"/>
+          <w:lang w:val="en-GB"/>
+        </w:rPr>
+      </w:pPr>
+      <w:proofErr w:type="spellStart"/>
+      <w:r>
+        <w:rPr>
+          <w:rFonts w:ascii="Calibri" w:hAnsi="Calibri" w:cs="Calibri"/>
+        </w:rPr>
+        <w:lastRenderedPageBreak/>
+        <w:t>LoadBalancer</w:t>
+      </w:r>
+      <w:proofErr w:type="spellEnd"/>
+      <w:r>
+        <w:rPr>
+          <w:rFonts w:ascii="Calibri" w:hAnsi="Calibri" w:cs="Calibri"/>
+        </w:rPr>
+        <w:br/>
+      </w:r>
+      <w:r>
+        <w:rPr>
+          <w:rFonts w:ascii="Calibri" w:hAnsi="Calibri" w:cs="Calibri"/>
+        </w:rPr>
+        <w:br/>
+      </w:r>
+      <w:proofErr w:type="spellStart"/>
+      <w:r>
+        <w:rPr>
+          <w:rFonts w:ascii="Calibri" w:hAnsi="Calibri" w:cs="Calibri"/>
+          <w:sz w:val="20"/>
+          <w:szCs w:val="20"/>
+          <w:lang w:val="en-GB"/>
+        </w:rPr>
+        <w:t>apiVersion</w:t>
+      </w:r>
+      <w:proofErr w:type="spellEnd"/>
+      <w:r>
+        <w:rPr>
+          <w:rFonts w:ascii="Calibri" w:hAnsi="Calibri" w:cs="Calibri"/>
+          <w:sz w:val="20"/>
+          <w:szCs w:val="20"/>
+          <w:lang w:val="en-GB"/>
+        </w:rPr>
+        <w:t>: v1</w:t>
+      </w:r>
+    </w:p>
+    <w:p>
+      <w:pPr>
+        <w:rPr>
+          <w:rFonts w:ascii="Calibri" w:hAnsi="Calibri" w:cs="Calibri"/>
+          <w:sz w:val="20"/>
+          <w:szCs w:val="20"/>
+          <w:lang w:val="en-GB"/>
+        </w:rPr>
+      </w:pPr>
+      <w:r>
+        <w:rPr>
+          <w:rFonts w:ascii="Calibri" w:hAnsi="Calibri" w:cs="Calibri"/>
+          <w:sz w:val="20"/>
+          <w:szCs w:val="20"/>
+          <w:lang w:val="en-GB"/>
+        </w:rPr>
+        <w:t>kind: Service</w:t>
+      </w:r>
+    </w:p>
+    <w:p>
+      <w:pPr>
+        <w:rPr>
+          <w:rFonts w:ascii="Calibri" w:hAnsi="Calibri" w:cs="Calibri"/>
+          <w:sz w:val="20"/>
+          <w:szCs w:val="20"/>
+          <w:lang w:val="en-GB"/>
+        </w:rPr>
+      </w:pPr>
+      <w:r>
+        <w:rPr>
+          <w:rFonts w:ascii="Calibri" w:hAnsi="Calibri" w:cs="Calibri"/>
+          <w:sz w:val="20"/>
+          <w:szCs w:val="20"/>
+          <w:lang w:val="en-GB"/>
+        </w:rPr>
+        <w:t>metadata:</w:t>
+      </w:r>
+    </w:p>
+    <w:p>
+      <w:pPr>
+        <w:rPr>
+          <w:rFonts w:ascii="Calibri" w:hAnsi="Calibri" w:cs="Calibri"/>
+          <w:sz w:val="20"/>
+          <w:szCs w:val="20"/>
+          <w:lang w:val="en-GB"/>
+        </w:rPr>
+      </w:pPr>
+      <w:r>
+        <w:rPr>
+          <w:rFonts w:ascii="Calibri" w:hAnsi="Calibri" w:cs="Calibri"/>
+          <w:sz w:val="20"/>
+          <w:szCs w:val="20"/>
+          <w:lang w:val="en-GB"/>
+        </w:rPr>
+        <w:t xml:space="preserve">  name: my-service</w:t>
+      </w:r>
+    </w:p>
+    <w:p>
+      <w:pPr>
+        <w:rPr>
+          <w:rFonts w:ascii="Calibri" w:hAnsi="Calibri" w:cs="Calibri"/>
+          <w:sz w:val="20"/>
+          <w:szCs w:val="20"/>
+          <w:lang w:val="en-GB"/>
+        </w:rPr>
+      </w:pPr>
+      <w:r>
+        <w:rPr>
+          <w:rFonts w:ascii="Calibri" w:hAnsi="Calibri" w:cs="Calibri"/>
+          <w:sz w:val="20"/>
+          <w:szCs w:val="20"/>
+          <w:lang w:val="en-GB"/>
+        </w:rPr>
+        <w:t>spec:</w:t>
+      </w:r>
+    </w:p>
+    <w:p>
+      <w:pPr>
+        <w:rPr>
+          <w:rFonts w:ascii="Calibri" w:hAnsi="Calibri" w:cs="Calibri"/>
+          <w:sz w:val="20"/>
+          <w:szCs w:val="20"/>
+          <w:lang w:val="en-GB"/>
+        </w:rPr>
+      </w:pPr>
+      <w:r>
+        <w:rPr>
+          <w:rFonts w:ascii="Calibri" w:hAnsi="Calibri" w:cs="Calibri"/>
+          <w:sz w:val="20"/>
+          <w:szCs w:val="20"/>
+          <w:lang w:val="en-GB"/>
+        </w:rPr>
+        <w:t xml:space="preserve">  selector:</w:t>
+      </w:r>
+    </w:p>
+    <w:p>
+      <w:pPr>
+        <w:rPr>
+          <w:rFonts w:ascii="Calibri" w:hAnsi="Calibri" w:cs="Calibri"/>
+          <w:sz w:val="20"/>
+          <w:szCs w:val="20"/>
+          <w:lang w:val="en-GB"/>
+        </w:rPr>
+      </w:pPr>
+      <w:r>
+        <w:rPr>
+          <w:rFonts w:ascii="Calibri" w:hAnsi="Calibri" w:cs="Calibri"/>
+          <w:sz w:val="20"/>
+          <w:szCs w:val="20"/>
+          <w:lang w:val="en-GB"/>
+        </w:rPr>
+        <w:t xml:space="preserve">    app.kubernetes.io/name: </w:t>
+      </w:r>
+      <w:proofErr w:type="spellStart"/>
+      <w:r>
+        <w:rPr>
+          <w:rFonts w:ascii="Calibri" w:hAnsi="Calibri" w:cs="Calibri"/>
+          <w:sz w:val="20"/>
+          <w:szCs w:val="20"/>
+          <w:lang w:val="en-GB"/>
+        </w:rPr>
+        <w:t>MyApp</w:t>
+      </w:r>
+      <w:proofErr w:type="spellEnd"/>
+    </w:p>
+    <w:p>
+      <w:pPr>
+        <w:rPr>
+          <w:rFonts w:ascii="Calibri" w:hAnsi="Calibri" w:cs="Calibri"/>
+          <w:sz w:val="20"/>
+          <w:szCs w:val="20"/>
+          <w:lang w:val="en-GB"/>
+        </w:rPr>
+      </w:pPr>
+      <w:r>
+        <w:rPr>
+          <w:rFonts w:ascii="Calibri" w:hAnsi="Calibri" w:cs="Calibri"/>
+          <w:sz w:val="20"/>
+          <w:szCs w:val="20"/>
+          <w:lang w:val="en-GB"/>
+        </w:rPr>
+        <w:t xml:space="preserve">  ports:</w:t>
+      </w:r>
+    </w:p>
+    <w:p>
+      <w:pPr>
+        <w:rPr>
+          <w:rFonts w:ascii="Calibri" w:hAnsi="Calibri" w:cs="Calibri"/>
+          <w:sz w:val="20"/>
+          <w:szCs w:val="20"/>
+          <w:lang w:val="en-GB"/>
+        </w:rPr>
+      </w:pPr>
+      <w:r>
+        <w:rPr>
+          <w:rFonts w:ascii="Calibri" w:hAnsi="Calibri" w:cs="Calibri"/>
+          <w:sz w:val="20"/>
+          <w:szCs w:val="20"/>
+          <w:lang w:val="en-GB"/>
+        </w:rPr>
+        <w:t xml:space="preserve">    - protocol: TCP</w:t>
+      </w:r>
+    </w:p>
+    <w:p>
+      <w:pPr>
+        <w:rPr>
+          <w:rFonts w:ascii="Calibri" w:hAnsi="Calibri" w:cs="Calibri"/>
+          <w:sz w:val="20"/>
+          <w:szCs w:val="20"/>
+          <w:lang w:val="en-GB"/>
+        </w:rPr>
+      </w:pPr>
+      <w:r>
+        <w:rPr>
+          <w:rFonts w:ascii="Calibri" w:hAnsi="Calibri" w:cs="Calibri"/>
+          <w:sz w:val="20"/>
+          <w:szCs w:val="20"/>
+          <w:lang w:val="en-GB"/>
+        </w:rPr>
+        <w:t xml:space="preserve">      port: 80</w:t>
+      </w:r>
+    </w:p>
+    <w:p>
+      <w:pPr>
+        <w:rPr>
+          <w:rFonts w:ascii="Calibri" w:hAnsi="Calibri" w:cs="Calibri"/>
+          <w:sz w:val="20"/>
+          <w:szCs w:val="20"/>
+          <w:lang w:val="en-GB"/>
+        </w:rPr>
+      </w:pPr>
+      <w:r>
+        <w:rPr>
+          <w:rFonts w:ascii="Calibri" w:hAnsi="Calibri" w:cs="Calibri"/>
+          <w:sz w:val="20"/>
+          <w:szCs w:val="20"/>
+          <w:lang w:val="en-GB"/>
+        </w:rPr>
+        <w:t xml:space="preserve">      </w:t>
+      </w:r>
+      <w:proofErr w:type="spellStart"/>
+      <w:r>
+        <w:rPr>
+          <w:rFonts w:ascii="Calibri" w:hAnsi="Calibri" w:cs="Calibri"/>
+          <w:sz w:val="20"/>
+          <w:szCs w:val="20"/>
+          <w:lang w:val="en-GB"/>
+        </w:rPr>
+        <w:t>targetPort</w:t>
+      </w:r>
+      <w:proofErr w:type="spellEnd"/>
+      <w:r>
+        <w:rPr>
+          <w:rFonts w:ascii="Calibri" w:hAnsi="Calibri" w:cs="Calibri"/>
+          <w:sz w:val="20"/>
+          <w:szCs w:val="20"/>
+          <w:lang w:val="en-GB"/>
+        </w:rPr>
+        <w:t>: 9376</w:t>
+      </w:r>
+    </w:p>
+    <w:p>
+      <w:pPr>
+        <w:rPr>
+          <w:rFonts w:ascii="Calibri" w:hAnsi="Calibri" w:cs="Calibri"/>
+          <w:sz w:val="20"/>
+          <w:szCs w:val="20"/>
+        </w:rPr>
+      </w:pPr>
+      <w:r>
+        <w:rPr>
+          <w:rFonts w:ascii="Calibri" w:hAnsi="Calibri" w:cs="Calibri"/>
+          <w:sz w:val="20"/>
+          <w:szCs w:val="20"/>
+          <w:lang w:val="en-GB"/>
+        </w:rPr>
+        <w:t xml:space="preserve">This service will route to any pods listening on port 9376 </w:t>
+      </w:r>
+      <w:r>
+        <w:rPr>
+          <w:rFonts w:ascii="Calibri" w:hAnsi="Calibri" w:cs="Calibri"/>
+          <w:sz w:val="20"/>
+          <w:szCs w:val="20"/>
+        </w:rPr>
+        <w:t>having</w:t>
+      </w:r>
+      <w:r>
+        <w:rPr>
+          <w:rFonts w:ascii="Calibri" w:hAnsi="Calibri" w:cs="Calibri"/>
+          <w:sz w:val="20"/>
+          <w:szCs w:val="20"/>
+        </w:rPr>
+        <w:t xml:space="preserve"> the app.kubernetes.io/name: </w:t>
+      </w:r>
+      <w:proofErr w:type="spellStart"/>
+      <w:r>
+        <w:rPr>
+          <w:rFonts w:ascii="Calibri" w:hAnsi="Calibri" w:cs="Calibri"/>
+          <w:sz w:val="20"/>
+          <w:szCs w:val="20"/>
+        </w:rPr>
+        <w:t>MyApp</w:t>
+      </w:r>
+      <w:proofErr w:type="spellEnd"/>
+      <w:r>
+        <w:rPr>
+          <w:rFonts w:ascii="Calibri" w:hAnsi="Calibri" w:cs="Calibri"/>
+          <w:sz w:val="20"/>
+          <w:szCs w:val="20"/>
+        </w:rPr>
+        <w:t> label</w:t>
+      </w:r>
+      <w:r>
+        <w:rPr>
+          <w:rFonts w:ascii="Calibri" w:hAnsi="Calibri" w:cs="Calibri"/>
+          <w:sz w:val="20"/>
+          <w:szCs w:val="20"/>
+        </w:rPr>
+        <w:t xml:space="preserve">, </w:t>
+      </w:r>
+      <w:r>
+        <w:rPr>
+          <w:rFonts w:ascii="Calibri" w:hAnsi="Calibri" w:cs="Calibri"/>
+          <w:sz w:val="20"/>
+          <w:szCs w:val="20"/>
+          <w:lang w:val="en-GB"/>
+        </w:rPr>
+        <w:t>and is itself listening on port 80.</w:t>
+      </w:r>
+      <w:r>
+        <w:rPr>
+          <w:rFonts w:ascii="Calibri" w:hAnsi="Calibri" w:cs="Calibri"/>
+          <w:sz w:val="20"/>
+          <w:szCs w:val="20"/>
+          <w:lang w:val="en-GB"/>
+        </w:rPr>
+        <w:br/>
+      </w:r>
+      <w:proofErr w:type="spellStart"/>
+      <w:r>
+        <w:rPr>
+          <w:rFonts w:ascii="Calibri" w:hAnsi="Calibri" w:cs="Calibri"/>
+          <w:sz w:val="20"/>
+          <w:szCs w:val="20"/>
+          <w:lang w:val="en-GB"/>
+        </w:rPr>
+        <w:t>targetPort</w:t>
+      </w:r>
+      <w:proofErr w:type="spellEnd"/>
+      <w:r>
+        <w:rPr>
+          <w:rFonts w:ascii="Calibri" w:hAnsi="Calibri" w:cs="Calibri"/>
+          <w:sz w:val="20"/>
+          <w:szCs w:val="20"/>
+          <w:lang w:val="en-GB"/>
+        </w:rPr>
+        <w:t xml:space="preserve"> = port of the application to route to</w:t>
+      </w:r>
+      <w:r>
+        <w:rPr>
+          <w:rFonts w:ascii="Calibri" w:hAnsi="Calibri" w:cs="Calibri"/>
+          <w:sz w:val="20"/>
+          <w:szCs w:val="20"/>
+          <w:lang w:val="en-GB"/>
+        </w:rPr>
+        <w:br/>
+        <w:t xml:space="preserve">port = </w:t>
+      </w:r>
+      <w:r>
+        <w:rPr>
+          <w:rFonts w:ascii="Calibri" w:hAnsi="Calibri" w:cs="Calibri"/>
+          <w:sz w:val="20"/>
+          <w:szCs w:val="20"/>
+          <w:lang w:val="en-GB"/>
+        </w:rPr>
+        <w:t>port on which the service is exposed that clients can use if they don’t know application IP (especially because in most cases it keeps changing)</w:t>
+      </w:r>
+      <w:r>
+        <w:rPr>
+          <w:rFonts w:ascii="Calibri" w:hAnsi="Calibri" w:cs="Calibri"/>
+          <w:sz w:val="20"/>
+          <w:szCs w:val="20"/>
+          <w:lang w:val="en-GB"/>
+        </w:rPr>
+        <w:br/>
+      </w:r>
+      <w:r>
+        <w:rPr>
+          <w:rFonts w:ascii="Calibri" w:hAnsi="Calibri" w:cs="Calibri"/>
+          <w:sz w:val="20"/>
+          <w:szCs w:val="20"/>
+          <w:lang w:val="en-GB"/>
+        </w:rPr>
+        <w:br/>
+      </w:r>
+      <w:r>
+        <w:rPr>
+          <w:rFonts w:ascii="Calibri" w:hAnsi="Calibri" w:cs="Calibri"/>
+          <w:sz w:val="20"/>
+          <w:szCs w:val="20"/>
+        </w:rPr>
+        <w:t>Port definitions</w:t>
+      </w:r>
+    </w:p>
+    <w:p>
+      <w:pPr>
+        <w:rPr>
+          <w:rFonts w:ascii="Calibri" w:hAnsi="Calibri" w:cs="Calibri"/>
+          <w:sz w:val="20"/>
+          <w:szCs w:val="20"/>
+        </w:rPr>
+      </w:pPr>
+      <w:r>
+        <w:rPr>
+          <w:rFonts w:ascii="Calibri" w:hAnsi="Calibri" w:cs="Calibri"/>
+          <w:sz w:val="20"/>
+          <w:szCs w:val="20"/>
+        </w:rPr>
+        <w:t>Port definitions in Pods have names, and you can reference these names in the </w:t>
+      </w:r>
+      <w:proofErr w:type="spellStart"/>
+      <w:r>
+        <w:rPr>
+          <w:rFonts w:ascii="Calibri" w:hAnsi="Calibri" w:cs="Calibri"/>
+          <w:sz w:val="20"/>
+          <w:szCs w:val="20"/>
+        </w:rPr>
+        <w:t>targetPort</w:t>
+      </w:r>
+      <w:proofErr w:type="spellEnd"/>
+      <w:r>
+        <w:rPr>
+          <w:rFonts w:ascii="Calibri" w:hAnsi="Calibri" w:cs="Calibri"/>
+          <w:sz w:val="20"/>
+          <w:szCs w:val="20"/>
+        </w:rPr>
+        <w:t> attribute of a Service. For example, we can bind the </w:t>
+      </w:r>
+      <w:proofErr w:type="spellStart"/>
+      <w:r>
+        <w:rPr>
+          <w:rFonts w:ascii="Calibri" w:hAnsi="Calibri" w:cs="Calibri"/>
+          <w:sz w:val="20"/>
+          <w:szCs w:val="20"/>
+        </w:rPr>
+        <w:t>targetPort</w:t>
+      </w:r>
+      <w:proofErr w:type="spellEnd"/>
+      <w:r>
+        <w:rPr>
+          <w:rFonts w:ascii="Calibri" w:hAnsi="Calibri" w:cs="Calibri"/>
+          <w:sz w:val="20"/>
+          <w:szCs w:val="20"/>
+        </w:rPr>
+        <w:t> of the Service to the Pod port in the following way:</w:t>
+      </w:r>
+    </w:p>
+    <w:p>
+      <w:pPr>
+        <w:rPr>
+          <w:rFonts w:ascii="Calibri" w:hAnsi="Calibri" w:cs="Calibri"/>
+          <w:sz w:val="20"/>
+          <w:szCs w:val="20"/>
+        </w:rPr>
+      </w:pPr>
+      <w:proofErr w:type="spellStart"/>
+      <w:r>
+        <w:rPr>
+          <w:rFonts w:ascii="Calibri" w:hAnsi="Calibri" w:cs="Calibri"/>
+          <w:sz w:val="20"/>
+          <w:szCs w:val="20"/>
+        </w:rPr>
+        <w:t>apiVersion</w:t>
+      </w:r>
+      <w:proofErr w:type="spellEnd"/>
+      <w:r>
+        <w:rPr>
+          <w:rFonts w:ascii="Calibri" w:hAnsi="Calibri" w:cs="Calibri"/>
+          <w:sz w:val="20"/>
+          <w:szCs w:val="20"/>
+        </w:rPr>
+        <w:t>: v1</w:t>
+      </w:r>
+    </w:p>
+    <w:p>
+      <w:pPr>
+        <w:rPr>
+          <w:rFonts w:ascii="Calibri" w:hAnsi="Calibri" w:cs="Calibri"/>
+          <w:sz w:val="20"/>
+          <w:szCs w:val="20"/>
+        </w:rPr>
+      </w:pPr>
+      <w:r>
+        <w:rPr>
+          <w:rFonts w:ascii="Calibri" w:hAnsi="Calibri" w:cs="Calibri"/>
+          <w:sz w:val="20"/>
+          <w:szCs w:val="20"/>
+        </w:rPr>
+        <w:t>kind: Service</w:t>
+      </w:r>
+    </w:p>
+    <w:p>
+      <w:pPr>
+        <w:rPr>
+          <w:rFonts w:ascii="Calibri" w:hAnsi="Calibri" w:cs="Calibri"/>
+          <w:sz w:val="20"/>
+          <w:szCs w:val="20"/>
+        </w:rPr>
+      </w:pPr>
+      <w:r>
+        <w:rPr>
+          <w:rFonts w:ascii="Calibri" w:hAnsi="Calibri" w:cs="Calibri"/>
+          <w:sz w:val="20"/>
+          <w:szCs w:val="20"/>
+        </w:rPr>
+        <w:t>metadata:</w:t>
+      </w:r>
+    </w:p>
+    <w:p>
+      <w:pPr>
+        <w:rPr>
+          <w:rFonts w:ascii="Calibri" w:hAnsi="Calibri" w:cs="Calibri"/>
+          <w:sz w:val="20"/>
+          <w:szCs w:val="20"/>
+        </w:rPr>
+      </w:pPr>
+      <w:r>
+        <w:rPr>
+          <w:rFonts w:ascii="Calibri" w:hAnsi="Calibri" w:cs="Calibri"/>
+          <w:sz w:val="20"/>
+          <w:szCs w:val="20"/>
+        </w:rPr>
+        <w:t xml:space="preserve">  name: nginx-service</w:t>
+      </w:r>
+    </w:p>
+    <w:p>
+      <w:pPr>
+        <w:rPr>
+          <w:rFonts w:ascii="Calibri" w:hAnsi="Calibri" w:cs="Calibri"/>
+          <w:sz w:val="20"/>
+          <w:szCs w:val="20"/>
+        </w:rPr>
+      </w:pPr>
+      <w:r>
+        <w:rPr>
+          <w:rFonts w:ascii="Calibri" w:hAnsi="Calibri" w:cs="Calibri"/>
+          <w:sz w:val="20"/>
+          <w:szCs w:val="20"/>
+        </w:rPr>
+        <w:t>spec:</w:t>
+      </w:r>
+    </w:p>
+    <w:p>
+      <w:pPr>
+        <w:rPr>
+          <w:rFonts w:ascii="Calibri" w:hAnsi="Calibri" w:cs="Calibri"/>
+          <w:sz w:val="20"/>
+          <w:szCs w:val="20"/>
+        </w:rPr>
+      </w:pPr>
+      <w:r>
+        <w:rPr>
+          <w:rFonts w:ascii="Calibri" w:hAnsi="Calibri" w:cs="Calibri"/>
+          <w:sz w:val="20"/>
+          <w:szCs w:val="20"/>
+        </w:rPr>
+        <w:t xml:space="preserve">  selector:</w:t>
+      </w:r>
+    </w:p>
+    <w:p>
+      <w:pPr>
+        <w:rPr>
+          <w:rFonts w:ascii="Calibri" w:hAnsi="Calibri" w:cs="Calibri"/>
+          <w:sz w:val="20"/>
+          <w:szCs w:val="20"/>
+        </w:rPr>
+      </w:pPr>
+      <w:r>
+        <w:rPr>
+          <w:rFonts w:ascii="Calibri" w:hAnsi="Calibri" w:cs="Calibri"/>
+          <w:sz w:val="20"/>
+          <w:szCs w:val="20"/>
+        </w:rPr>
+        <w:t xml:space="preserve">    app.kubernetes.io/name: proxy</w:t>
+      </w:r>
+    </w:p>
+    <w:p>
+      <w:pPr>
+        <w:rPr>
+          <w:rFonts w:ascii="Calibri" w:hAnsi="Calibri" w:cs="Calibri"/>
+          <w:sz w:val="20"/>
+          <w:szCs w:val="20"/>
+        </w:rPr>
+      </w:pPr>
+      <w:r>
+        <w:rPr>
+          <w:rFonts w:ascii="Calibri" w:hAnsi="Calibri" w:cs="Calibri"/>
+          <w:sz w:val="20"/>
+          <w:szCs w:val="20"/>
+        </w:rPr>
+        <w:t xml:space="preserve">  ports:</w:t>
+      </w:r>
+    </w:p>
+    <w:p>
+      <w:pPr>
+        <w:rPr>
+          <w:rFonts w:ascii="Calibri" w:hAnsi="Calibri" w:cs="Calibri"/>
+          <w:sz w:val="20"/>
+          <w:szCs w:val="20"/>
+        </w:rPr>
+      </w:pPr>
+      <w:r>
+        <w:rPr>
+          <w:rFonts w:ascii="Calibri" w:hAnsi="Calibri" w:cs="Calibri"/>
+          <w:sz w:val="20"/>
+          <w:szCs w:val="20"/>
+        </w:rPr>
+        <w:t xml:space="preserve">  - name: name-of-service-port</w:t>
+      </w:r>
+    </w:p>
+    <w:p>
+      <w:pPr>
+        <w:rPr>
+          <w:rFonts w:ascii="Calibri" w:hAnsi="Calibri" w:cs="Calibri"/>
+          <w:sz w:val="20"/>
+          <w:szCs w:val="20"/>
+        </w:rPr>
+      </w:pPr>
+      <w:r>
+        <w:rPr>
+          <w:rFonts w:ascii="Calibri" w:hAnsi="Calibri" w:cs="Calibri"/>
+          <w:sz w:val="20"/>
+          <w:szCs w:val="20"/>
+        </w:rPr>
+        <w:t xml:space="preserve">    protocol: TCP</w:t>
+      </w:r>
+    </w:p>
+    <w:p>
+      <w:pPr>
+        <w:rPr>
+          <w:rFonts w:ascii="Calibri" w:hAnsi="Calibri" w:cs="Calibri"/>
+          <w:sz w:val="20"/>
+          <w:szCs w:val="20"/>
+        </w:rPr>
+      </w:pPr>
+      <w:r>
+        <w:rPr>
+          <w:rFonts w:ascii="Calibri" w:hAnsi="Calibri" w:cs="Calibri"/>
+          <w:sz w:val="20"/>
+          <w:szCs w:val="20"/>
+        </w:rPr>
+        <w:t xml:space="preserve">    port: 80</w:t>
+      </w:r>
+    </w:p>
+    <w:p>
+      <w:pPr>
+        <w:rPr>
+          <w:rFonts w:ascii="Calibri" w:hAnsi="Calibri" w:cs="Calibri"/>
+          <w:sz w:val="20"/>
+          <w:szCs w:val="20"/>
+        </w:rPr>
+      </w:pPr>
+      <w:r>
+        <w:rPr>
+          <w:rFonts w:ascii="Calibri" w:hAnsi="Calibri" w:cs="Calibri"/>
+          <w:sz w:val="20"/>
+          <w:szCs w:val="20"/>
+        </w:rPr>
+        <w:t xml:space="preserve">    </w:t>
+      </w:r>
+      <w:proofErr w:type="spellStart"/>
+      <w:r>
+        <w:rPr>
+          <w:rFonts w:ascii="Calibri" w:hAnsi="Calibri" w:cs="Calibri"/>
+          <w:sz w:val="20"/>
+          <w:szCs w:val="20"/>
+        </w:rPr>
+        <w:t>targetPort</w:t>
+      </w:r>
+      <w:proofErr w:type="spellEnd"/>
+      <w:r>
+        <w:rPr>
+          <w:rFonts w:ascii="Calibri" w:hAnsi="Calibri" w:cs="Calibri"/>
+          <w:sz w:val="20"/>
+          <w:szCs w:val="20"/>
+        </w:rPr>
+        <w:t>: http-web-svc</w:t>
+      </w:r>
+    </w:p>
+    <w:p>
+      <w:pPr>
+        <w:rPr>
+          <w:rFonts w:ascii="Calibri" w:hAnsi="Calibri" w:cs="Calibri"/>
+          <w:sz w:val="20"/>
+          <w:szCs w:val="20"/>
+        </w:rPr>
+      </w:pPr>
+    </w:p>
+    <w:p>
+      <w:pPr>
+        <w:rPr>
+          <w:rFonts w:ascii="Calibri" w:hAnsi="Calibri" w:cs="Calibri"/>
+          <w:sz w:val="20"/>
+          <w:szCs w:val="20"/>
+        </w:rPr>
+      </w:pPr>
+      <w:r>
+        <w:rPr>
+          <w:rFonts w:ascii="Calibri" w:hAnsi="Calibri" w:cs="Calibri"/>
+          <w:sz w:val="20"/>
+          <w:szCs w:val="20"/>
+        </w:rPr>
+        <w:t>---</w:t>
+      </w:r>
+    </w:p>
+    <w:p>
+      <w:pPr>
+        <w:rPr>
+          <w:rFonts w:ascii="Calibri" w:hAnsi="Calibri" w:cs="Calibri"/>
+          <w:sz w:val="20"/>
+          <w:szCs w:val="20"/>
+        </w:rPr>
+      </w:pPr>
+      <w:proofErr w:type="spellStart"/>
+      <w:r>
+        <w:rPr>
+          <w:rFonts w:ascii="Calibri" w:hAnsi="Calibri" w:cs="Calibri"/>
+          <w:sz w:val="20"/>
+          <w:szCs w:val="20"/>
+        </w:rPr>
+        <w:t>apiVersion</w:t>
+      </w:r>
+      <w:proofErr w:type="spellEnd"/>
+      <w:r>
+        <w:rPr>
+          <w:rFonts w:ascii="Calibri" w:hAnsi="Calibri" w:cs="Calibri"/>
+          <w:sz w:val="20"/>
+          <w:szCs w:val="20"/>
+        </w:rPr>
+        <w:t>: v1</w:t>
+      </w:r>
+    </w:p>
+    <w:p>
+      <w:pPr>
+        <w:rPr>
+          <w:rFonts w:ascii="Calibri" w:hAnsi="Calibri" w:cs="Calibri"/>
+          <w:sz w:val="20"/>
+          <w:szCs w:val="20"/>
+        </w:rPr>
+      </w:pPr>
+      <w:r>
+        <w:rPr>
+          <w:rFonts w:ascii="Calibri" w:hAnsi="Calibri" w:cs="Calibri"/>
+          <w:sz w:val="20"/>
+          <w:szCs w:val="20"/>
+        </w:rPr>
+        <w:t>kind: Pod</w:t>
+      </w:r>
+    </w:p>
+    <w:p>
+      <w:pPr>
+        <w:rPr>
+          <w:rFonts w:ascii="Calibri" w:hAnsi="Calibri" w:cs="Calibri"/>
+          <w:sz w:val="20"/>
+          <w:szCs w:val="20"/>
+        </w:rPr>
+      </w:pPr>
+      <w:r>
+        <w:rPr>
+          <w:rFonts w:ascii="Calibri" w:hAnsi="Calibri" w:cs="Calibri"/>
+          <w:sz w:val="20"/>
+          <w:szCs w:val="20"/>
+        </w:rPr>
+        <w:t>metadata:</w:t>
+      </w:r>
+    </w:p>
+    <w:p>
+      <w:pPr>
+        <w:rPr>
+          <w:rFonts w:ascii="Calibri" w:hAnsi="Calibri" w:cs="Calibri"/>
+          <w:sz w:val="20"/>
+          <w:szCs w:val="20"/>
+        </w:rPr>
+      </w:pPr>
+      <w:r>
+        <w:rPr>
+          <w:rFonts w:ascii="Calibri" w:hAnsi="Calibri" w:cs="Calibri"/>
+          <w:sz w:val="20"/>
+          <w:szCs w:val="20"/>
+        </w:rPr>
+        <w:t xml:space="preserve">  name: nginx</w:t>
+      </w:r>
+    </w:p>
+    <w:p>
+      <w:pPr>
+        <w:rPr>
+          <w:rFonts w:ascii="Calibri" w:hAnsi="Calibri" w:cs="Calibri"/>
+          <w:sz w:val="20"/>
+          <w:szCs w:val="20"/>
+        </w:rPr>
+      </w:pPr>
+      <w:r>
+        <w:rPr>
+          <w:rFonts w:ascii="Calibri" w:hAnsi="Calibri" w:cs="Calibri"/>
+          <w:sz w:val="20"/>
+          <w:szCs w:val="20"/>
+        </w:rPr>
+        <w:t xml:space="preserve">  labels:</w:t>
+      </w:r>
+    </w:p>
+    <w:p>
+      <w:pPr>
+        <w:rPr>
+          <w:rFonts w:ascii="Calibri" w:hAnsi="Calibri" w:cs="Calibri"/>
+          <w:sz w:val="20"/>
+          <w:szCs w:val="20"/>
+        </w:rPr>
+      </w:pPr>
+      <w:r>
+        <w:rPr>
+          <w:rFonts w:ascii="Calibri" w:hAnsi="Calibri" w:cs="Calibri"/>
+          <w:sz w:val="20"/>
+          <w:szCs w:val="20"/>
+        </w:rPr>
+        <w:t xml:space="preserve">    app.kubernetes.io/name: proxy</w:t>
+      </w:r>
+    </w:p>
+    <w:p>
+      <w:pPr>
+        <w:rPr>
+          <w:rFonts w:ascii="Calibri" w:hAnsi="Calibri" w:cs="Calibri"/>
+          <w:sz w:val="20"/>
+          <w:szCs w:val="20"/>
+        </w:rPr>
+      </w:pPr>
+      <w:r>
+        <w:rPr>
+          <w:rFonts w:ascii="Calibri" w:hAnsi="Calibri" w:cs="Calibri"/>
+          <w:sz w:val="20"/>
+          <w:szCs w:val="20"/>
+        </w:rPr>
+        <w:t>spec:</w:t>
+      </w:r>
+    </w:p>
+    <w:p>
+      <w:pPr>
+        <w:rPr>
+          <w:rFonts w:ascii="Calibri" w:hAnsi="Calibri" w:cs="Calibri"/>
+          <w:sz w:val="20"/>
+          <w:szCs w:val="20"/>
+        </w:rPr>
+      </w:pPr>
+      <w:r>
+        <w:rPr>
+          <w:rFonts w:ascii="Calibri" w:hAnsi="Calibri" w:cs="Calibri"/>
+          <w:sz w:val="20"/>
+          <w:szCs w:val="20"/>
+        </w:rPr>
+        <w:t xml:space="preserve">  containers:</w:t>
+      </w:r>
+    </w:p>
+    <w:p>
+      <w:pPr>
+        <w:rPr>
+          <w:rFonts w:ascii="Calibri" w:hAnsi="Calibri" w:cs="Calibri"/>
+          <w:sz w:val="20"/>
+          <w:szCs w:val="20"/>
+        </w:rPr>
+      </w:pPr>
+      <w:r>
+        <w:rPr>
+          <w:rFonts w:ascii="Calibri" w:hAnsi="Calibri" w:cs="Calibri"/>
+          <w:sz w:val="20"/>
+          <w:szCs w:val="20"/>
+        </w:rPr>
+        <w:t xml:space="preserve">  - name: nginx</w:t>
+      </w:r>
+    </w:p>
+    <w:p>
+      <w:pPr>
+        <w:rPr>
+          <w:rFonts w:ascii="Calibri" w:hAnsi="Calibri" w:cs="Calibri"/>
+          <w:sz w:val="20"/>
+          <w:szCs w:val="20"/>
+        </w:rPr>
+      </w:pPr>
+      <w:r>
+        <w:rPr>
+          <w:rFonts w:ascii="Calibri" w:hAnsi="Calibri" w:cs="Calibri"/>
+          <w:sz w:val="20"/>
+          <w:szCs w:val="20"/>
+        </w:rPr>
+        <w:t xml:space="preserve">    image: </w:t>
+      </w:r>
+      <w:proofErr w:type="spellStart"/>
+      <w:proofErr w:type="gramStart"/>
+      <w:r>
+        <w:rPr>
+          <w:rFonts w:ascii="Calibri" w:hAnsi="Calibri" w:cs="Calibri"/>
+          <w:sz w:val="20"/>
+          <w:szCs w:val="20"/>
+        </w:rPr>
+        <w:t>nginx:stable</w:t>
+      </w:r>
+      <w:proofErr w:type="spellEnd"/>
+      <w:proofErr w:type="gramEnd"/>
+    </w:p>
+    <w:p>
+      <w:pPr>
+        <w:rPr>
+          <w:rFonts w:ascii="Calibri" w:hAnsi="Calibri" w:cs="Calibri"/>
+          <w:sz w:val="20"/>
+          <w:szCs w:val="20"/>
+        </w:rPr>
+      </w:pPr>
+      <w:r>
+        <w:rPr>
+          <w:rFonts w:ascii="Calibri" w:hAnsi="Calibri" w:cs="Calibri"/>
+          <w:sz w:val="20"/>
+          <w:szCs w:val="20"/>
+        </w:rPr>
+        <w:t xml:space="preserve">    ports:</w:t>
+      </w:r>
+    </w:p>
+    <w:p>
+      <w:pPr>
+        <w:rPr>
+          <w:rFonts w:ascii="Calibri" w:hAnsi="Calibri" w:cs="Calibri"/>
+          <w:sz w:val="20"/>
+          <w:szCs w:val="20"/>
+        </w:rPr>
+      </w:pPr>
+      <w:r>
+        <w:rPr>
+          <w:rFonts w:ascii="Calibri" w:hAnsi="Calibri" w:cs="Calibri"/>
+          <w:sz w:val="20"/>
+          <w:szCs w:val="20"/>
+        </w:rPr>
+        <w:t xml:space="preserve">      - </w:t>
+      </w:r>
+      <w:proofErr w:type="spellStart"/>
+      <w:r>
+        <w:rPr>
+          <w:rFonts w:ascii="Calibri" w:hAnsi="Calibri" w:cs="Calibri"/>
+          <w:sz w:val="20"/>
+          <w:szCs w:val="20"/>
+        </w:rPr>
+        <w:t>containerPort</w:t>
+      </w:r>
+      <w:proofErr w:type="spellEnd"/>
+      <w:r>
+        <w:rPr>
+          <w:rFonts w:ascii="Calibri" w:hAnsi="Calibri" w:cs="Calibri"/>
+          <w:sz w:val="20"/>
+          <w:szCs w:val="20"/>
+        </w:rPr>
+        <w:t>: 80</w:t>
+      </w:r>
+    </w:p>
+    <w:p>
+      <w:pPr>
+        <w:rPr>
+          <w:rFonts w:ascii="Calibri" w:hAnsi="Calibri" w:cs="Calibri"/>
+          <w:sz w:val="20"/>
+          <w:szCs w:val="20"/>
+        </w:rPr>
+      </w:pPr>
+      <w:r>
+        <w:rPr>
+          <w:rFonts w:ascii="Calibri" w:hAnsi="Calibri" w:cs="Calibri"/>
+          <w:sz w:val="20"/>
+          <w:szCs w:val="20"/>
+        </w:rPr>
+        <w:t xml:space="preserve">        name: http-web-svc</w:t>
+      </w:r>
+    </w:p>
+    <w:p>
+      <w:pPr>
+        <w:rPr>
+          <w:rFonts w:ascii="Calibri" w:hAnsi="Calibri" w:cs="Calibri"/>
+          <w:sz w:val="20"/>
+          <w:szCs w:val="20"/>
           <w:lang w:val="en-GB"/>
         </w:rPr>
       </w:pPr>

</xml_diff>